<commit_message>
Fix Week 1 Note
</commit_message>
<xml_diff>
--- a/Modules/Week1/Week 1 Note.docx
+++ b/Modules/Week1/Week 1 Note.docx
@@ -208,7 +208,7 @@
           <w:szCs w:val="24"/>
           <w:lang w:val="en-US"/>
         </w:rPr>
-        <w:t>: Intelligent System (IS), Artificial Intelligence (AI), Intelligent Agent (IA), Machine Learning (ML)&lt; Deep Learning (DL), Cognitive Computing and others</w:t>
+        <w:t>: Intelligent System (IS), Artificial Intelligence (AI), Intelligent Agent (IA), Machine Learning (ML), Deep Learning (DL), Cognitive Computing and others</w:t>
       </w:r>
     </w:p>
     <w:p>
@@ -878,204 +878,33 @@
         <w:ind w:left="0" w:leftChars="0" w:firstLine="0" w:firstLineChars="0"/>
         <w:rPr>
           <w:rFonts w:hint="default" w:ascii="Times New Roman" w:hAnsi="Times New Roman" w:eastAsia="SimSun" w:cs="Times New Roman"/>
-          <w:sz w:val="24"/>
-          <w:szCs w:val="24"/>
-          <w:lang w:val="en-US"/>
-        </w:rPr>
-      </w:pPr>
-      <w:r>
-        <w:rPr>
-          <w:rFonts w:hint="default" w:ascii="Times New Roman" w:hAnsi="Times New Roman" w:eastAsia="SimSun" w:cs="Times New Roman"/>
-          <w:sz w:val="24"/>
-          <w:szCs w:val="24"/>
-          <w:lang w:val="en-US"/>
-        </w:rPr>
-        <w:t xml:space="preserve">Types of </w:t>
-      </w:r>
-      <w:r>
-        <w:rPr>
-          <w:rFonts w:hint="default" w:ascii="Times New Roman" w:hAnsi="Times New Roman" w:eastAsia="SimSun" w:cs="Times New Roman"/>
-          <w:sz w:val="24"/>
-          <w:szCs w:val="24"/>
-        </w:rPr>
-        <w:t>Intelligent Agents</w:t>
-      </w:r>
-    </w:p>
-    <w:p>
-      <w:pPr>
-        <w:pStyle w:val="2"/>
-        <w:keepNext w:val="0"/>
-        <w:keepLines w:val="0"/>
-        <w:widowControl/>
-        <w:suppressLineNumbers w:val="0"/>
-        <w:rPr>
-          <w:rFonts w:hint="default" w:ascii="Times New Roman" w:hAnsi="Times New Roman" w:cs="Times New Roman"/>
-        </w:rPr>
-      </w:pPr>
-      <w:r>
-        <w:rPr>
-          <w:rFonts w:hint="default" w:ascii="Times New Roman" w:hAnsi="Times New Roman" w:cs="Times New Roman"/>
-          <w:lang w:val="en-US"/>
-        </w:rPr>
-        <w:t xml:space="preserve">- </w:t>
-      </w:r>
-      <w:r>
-        <w:rPr>
-          <w:rFonts w:hint="default" w:ascii="Times New Roman" w:hAnsi="Times New Roman" w:cs="Times New Roman"/>
-        </w:rPr>
-        <w:t>Simple Reflex Agent</w:t>
-      </w:r>
-    </w:p>
-    <w:p>
-      <w:pPr>
-        <w:keepNext w:val="0"/>
-        <w:keepLines w:val="0"/>
-        <w:widowControl/>
-        <w:numPr>
-          <w:ilvl w:val="0"/>
-          <w:numId w:val="5"/>
-        </w:numPr>
-        <w:suppressLineNumbers w:val="0"/>
-        <w:spacing w:before="0" w:beforeAutospacing="1" w:after="0" w:afterAutospacing="1"/>
-        <w:ind w:left="720" w:hanging="360"/>
-        <w:rPr>
-          <w:rFonts w:hint="default" w:ascii="Times New Roman" w:hAnsi="Times New Roman" w:cs="Times New Roman"/>
-        </w:rPr>
-      </w:pPr>
-      <w:r>
-        <w:rPr>
-          <w:rFonts w:hint="default" w:ascii="Times New Roman" w:hAnsi="Times New Roman" w:cs="Times New Roman"/>
-        </w:rPr>
-        <w:t xml:space="preserve">Reacts only to current inputs </w:t>
-      </w:r>
-    </w:p>
-    <w:p>
-      <w:pPr>
-        <w:keepNext w:val="0"/>
-        <w:keepLines w:val="0"/>
-        <w:widowControl/>
-        <w:numPr>
-          <w:ilvl w:val="0"/>
-          <w:numId w:val="5"/>
-        </w:numPr>
-        <w:suppressLineNumbers w:val="0"/>
-        <w:spacing w:before="0" w:beforeAutospacing="1" w:after="0" w:afterAutospacing="1"/>
-        <w:ind w:left="720" w:hanging="360"/>
-        <w:rPr>
-          <w:rFonts w:hint="default" w:ascii="Times New Roman" w:hAnsi="Times New Roman" w:cs="Times New Roman"/>
           <w:b/>
           <w:bCs/>
-        </w:rPr>
-      </w:pPr>
-      <w:r>
-        <w:rPr>
-          <w:rFonts w:hint="default" w:ascii="Times New Roman" w:hAnsi="Times New Roman" w:cs="Times New Roman"/>
+          <w:sz w:val="28"/>
+          <w:szCs w:val="28"/>
+          <w:lang w:val="en-US"/>
+        </w:rPr>
+      </w:pPr>
+      <w:r>
+        <w:rPr>
+          <w:rFonts w:hint="default" w:ascii="Times New Roman" w:hAnsi="Times New Roman" w:eastAsia="SimSun" w:cs="Times New Roman"/>
           <w:b/>
           <w:bCs/>
-        </w:rPr>
-        <w:t xml:space="preserve">Uses condition–action rules </w:t>
-      </w:r>
-    </w:p>
-    <w:p>
-      <w:pPr>
-        <w:keepNext w:val="0"/>
-        <w:keepLines w:val="0"/>
-        <w:widowControl/>
-        <w:numPr>
-          <w:ilvl w:val="0"/>
-          <w:numId w:val="5"/>
-        </w:numPr>
-        <w:suppressLineNumbers w:val="0"/>
-        <w:spacing w:before="0" w:beforeAutospacing="1" w:after="0" w:afterAutospacing="1"/>
-        <w:ind w:left="720" w:hanging="360"/>
-        <w:rPr>
-          <w:rFonts w:hint="default" w:ascii="Times New Roman" w:hAnsi="Times New Roman" w:cs="Times New Roman"/>
-        </w:rPr>
-      </w:pPr>
-      <w:r>
-        <w:rPr>
-          <w:rFonts w:hint="default" w:ascii="Times New Roman" w:hAnsi="Times New Roman" w:cs="Times New Roman"/>
-        </w:rPr>
-        <w:t xml:space="preserve">Example: vacuum cleaner agent </w:t>
-      </w:r>
-    </w:p>
-    <w:p>
-      <w:pPr>
-        <w:pStyle w:val="2"/>
-        <w:keepNext w:val="0"/>
-        <w:keepLines w:val="0"/>
-        <w:widowControl/>
-        <w:suppressLineNumbers w:val="0"/>
-        <w:rPr>
-          <w:rFonts w:hint="default" w:ascii="Times New Roman" w:hAnsi="Times New Roman" w:cs="Times New Roman"/>
-        </w:rPr>
-      </w:pPr>
-      <w:r>
-        <w:rPr>
-          <w:rFonts w:hint="default" w:ascii="Times New Roman" w:hAnsi="Times New Roman" w:cs="Times New Roman"/>
+          <w:sz w:val="28"/>
+          <w:szCs w:val="28"/>
           <w:lang w:val="en-US"/>
         </w:rPr>
-        <w:t xml:space="preserve">- </w:t>
-      </w:r>
-      <w:r>
-        <w:rPr>
-          <w:rFonts w:hint="default" w:ascii="Times New Roman" w:hAnsi="Times New Roman" w:cs="Times New Roman"/>
-        </w:rPr>
-        <w:t>Model-Based Reflex Agent</w:t>
-      </w:r>
-    </w:p>
-    <w:p>
-      <w:pPr>
-        <w:keepNext w:val="0"/>
-        <w:keepLines w:val="0"/>
-        <w:widowControl/>
-        <w:numPr>
-          <w:ilvl w:val="0"/>
-          <w:numId w:val="6"/>
-        </w:numPr>
-        <w:suppressLineNumbers w:val="0"/>
-        <w:spacing w:before="0" w:beforeAutospacing="1" w:after="0" w:afterAutospacing="1"/>
-        <w:ind w:left="720" w:hanging="360"/>
-        <w:rPr>
-          <w:rFonts w:hint="default" w:ascii="Times New Roman" w:hAnsi="Times New Roman" w:cs="Times New Roman"/>
-        </w:rPr>
-      </w:pPr>
-      <w:r>
-        <w:rPr>
-          <w:rFonts w:hint="default" w:ascii="Times New Roman" w:hAnsi="Times New Roman" w:cs="Times New Roman"/>
-        </w:rPr>
-        <w:t xml:space="preserve">Maintains internal state </w:t>
-      </w:r>
-    </w:p>
-    <w:p>
-      <w:pPr>
-        <w:keepNext w:val="0"/>
-        <w:keepLines w:val="0"/>
-        <w:widowControl/>
-        <w:numPr>
-          <w:ilvl w:val="0"/>
-          <w:numId w:val="6"/>
-        </w:numPr>
-        <w:suppressLineNumbers w:val="0"/>
-        <w:spacing w:before="0" w:beforeAutospacing="1" w:after="0" w:afterAutospacing="1"/>
-        <w:ind w:left="720" w:hanging="360"/>
-        <w:rPr>
-          <w:rFonts w:hint="default" w:ascii="Times New Roman" w:hAnsi="Times New Roman" w:cs="Times New Roman"/>
-        </w:rPr>
-      </w:pPr>
-      <w:r>
-        <w:rPr>
-          <w:rFonts w:hint="default" w:ascii="Times New Roman" w:hAnsi="Times New Roman" w:cs="Times New Roman"/>
+        <w:t xml:space="preserve">Types of </w:t>
+      </w:r>
+      <w:r>
+        <w:rPr>
+          <w:rFonts w:hint="default" w:ascii="Times New Roman" w:hAnsi="Times New Roman" w:eastAsia="SimSun" w:cs="Times New Roman"/>
           <w:b/>
           <w:bCs/>
-        </w:rPr>
-        <w:t>Uses knowledge</w:t>
-      </w:r>
-      <w:r>
-        <w:rPr>
-          <w:rFonts w:hint="default" w:ascii="Times New Roman" w:hAnsi="Times New Roman" w:cs="Times New Roman"/>
-        </w:rPr>
-        <w:t xml:space="preserve"> about how the world changes </w:t>
+          <w:sz w:val="28"/>
+          <w:szCs w:val="28"/>
+        </w:rPr>
+        <w:t>Intelligent Agents</w:t>
       </w:r>
     </w:p>
     <w:p>
@@ -1087,67 +916,111 @@
         <w:suppressLineNumbers w:val="0"/>
         <w:rPr>
           <w:rFonts w:hint="default" w:ascii="Times New Roman" w:hAnsi="Times New Roman" w:cs="Times New Roman"/>
-        </w:rPr>
-      </w:pPr>
-      <w:r>
-        <w:rPr>
-          <w:rFonts w:hint="default" w:ascii="Times New Roman" w:hAnsi="Times New Roman" w:cs="Times New Roman"/>
-        </w:rPr>
-        <w:t>Goal-Based Agent</w:t>
-      </w:r>
-    </w:p>
-    <w:p>
-      <w:pPr>
-        <w:keepNext w:val="0"/>
-        <w:keepLines w:val="0"/>
-        <w:widowControl/>
-        <w:numPr>
-          <w:ilvl w:val="0"/>
-          <w:numId w:val="7"/>
-        </w:numPr>
-        <w:suppressLineNumbers w:val="0"/>
-        <w:spacing w:before="0" w:beforeAutospacing="1" w:after="0" w:afterAutospacing="1"/>
-        <w:ind w:left="720" w:hanging="360"/>
-        <w:rPr>
-          <w:rFonts w:hint="default" w:ascii="Times New Roman" w:hAnsi="Times New Roman" w:cs="Times New Roman"/>
-        </w:rPr>
-      </w:pPr>
-      <w:r>
-        <w:rPr>
-          <w:rFonts w:hint="default" w:ascii="Times New Roman" w:hAnsi="Times New Roman" w:cs="Times New Roman"/>
-        </w:rPr>
-        <w:t xml:space="preserve">Makes decisions based on goals </w:t>
-      </w:r>
-    </w:p>
-    <w:p>
-      <w:pPr>
-        <w:keepNext w:val="0"/>
-        <w:keepLines w:val="0"/>
-        <w:widowControl/>
-        <w:numPr>
-          <w:ilvl w:val="0"/>
-          <w:numId w:val="7"/>
-        </w:numPr>
-        <w:suppressLineNumbers w:val="0"/>
-        <w:spacing w:before="0" w:beforeAutospacing="1" w:after="0" w:afterAutospacing="1"/>
-        <w:ind w:left="720" w:hanging="360"/>
-        <w:rPr>
-          <w:rFonts w:hint="default" w:ascii="Times New Roman" w:hAnsi="Times New Roman" w:cs="Times New Roman"/>
-        </w:rPr>
-      </w:pPr>
-      <w:r>
+          <w:sz w:val="24"/>
+          <w:szCs w:val="24"/>
+        </w:rPr>
+      </w:pPr>
+      <w:r>
+        <w:rPr>
+          <w:rFonts w:hint="default" w:ascii="Times New Roman" w:hAnsi="Times New Roman" w:cs="Times New Roman"/>
+          <w:sz w:val="24"/>
+          <w:szCs w:val="24"/>
+          <w:lang w:val="en-US"/>
+        </w:rPr>
+        <w:t xml:space="preserve">- </w:t>
+      </w:r>
+      <w:r>
+        <w:rPr>
+          <w:rFonts w:hint="default" w:ascii="Times New Roman" w:hAnsi="Times New Roman" w:cs="Times New Roman"/>
+          <w:sz w:val="24"/>
+          <w:szCs w:val="24"/>
+        </w:rPr>
+        <w:t>Simple Reflex Agent</w:t>
+      </w:r>
+    </w:p>
+    <w:p>
+      <w:pPr>
+        <w:keepNext w:val="0"/>
+        <w:keepLines w:val="0"/>
+        <w:widowControl/>
+        <w:numPr>
+          <w:ilvl w:val="0"/>
+          <w:numId w:val="5"/>
+        </w:numPr>
+        <w:suppressLineNumbers w:val="0"/>
+        <w:spacing w:before="0" w:beforeAutospacing="1" w:after="0" w:afterAutospacing="1"/>
+        <w:ind w:left="720" w:hanging="360"/>
+        <w:rPr>
+          <w:rFonts w:hint="default" w:ascii="Times New Roman" w:hAnsi="Times New Roman" w:cs="Times New Roman"/>
+          <w:sz w:val="24"/>
+          <w:szCs w:val="24"/>
+        </w:rPr>
+      </w:pPr>
+      <w:r>
+        <w:rPr>
+          <w:rFonts w:hint="default" w:ascii="Times New Roman" w:hAnsi="Times New Roman" w:cs="Times New Roman"/>
+          <w:sz w:val="24"/>
+          <w:szCs w:val="24"/>
+        </w:rPr>
+        <w:t xml:space="preserve">Reacts only to current inputs </w:t>
+      </w:r>
+    </w:p>
+    <w:p>
+      <w:pPr>
+        <w:keepNext w:val="0"/>
+        <w:keepLines w:val="0"/>
+        <w:widowControl/>
+        <w:numPr>
+          <w:ilvl w:val="0"/>
+          <w:numId w:val="5"/>
+        </w:numPr>
+        <w:suppressLineNumbers w:val="0"/>
+        <w:spacing w:before="0" w:beforeAutospacing="1" w:after="0" w:afterAutospacing="1"/>
+        <w:ind w:left="720" w:hanging="360"/>
         <w:rPr>
           <w:rFonts w:hint="default" w:ascii="Times New Roman" w:hAnsi="Times New Roman" w:cs="Times New Roman"/>
           <w:b/>
           <w:bCs/>
-        </w:rPr>
-        <w:t>Considers future outcomes and planning</w:t>
-      </w:r>
-      <w:r>
-        <w:rPr>
-          <w:rFonts w:hint="default" w:ascii="Times New Roman" w:hAnsi="Times New Roman" w:cs="Times New Roman"/>
-        </w:rPr>
-        <w:t xml:space="preserve"> </w:t>
+          <w:sz w:val="24"/>
+          <w:szCs w:val="24"/>
+        </w:rPr>
+      </w:pPr>
+      <w:r>
+        <w:rPr>
+          <w:rFonts w:hint="default" w:ascii="Times New Roman" w:hAnsi="Times New Roman" w:cs="Times New Roman"/>
+          <w:b/>
+          <w:bCs/>
+          <w:sz w:val="24"/>
+          <w:szCs w:val="24"/>
+        </w:rPr>
+        <w:t xml:space="preserve">Uses condition–action rules </w:t>
+      </w:r>
+    </w:p>
+    <w:p>
+      <w:pPr>
+        <w:keepNext w:val="0"/>
+        <w:keepLines w:val="0"/>
+        <w:widowControl/>
+        <w:numPr>
+          <w:ilvl w:val="0"/>
+          <w:numId w:val="5"/>
+        </w:numPr>
+        <w:suppressLineNumbers w:val="0"/>
+        <w:spacing w:before="0" w:beforeAutospacing="1" w:after="0" w:afterAutospacing="1"/>
+        <w:ind w:left="720" w:hanging="360"/>
+        <w:rPr>
+          <w:rFonts w:hint="default" w:ascii="Times New Roman" w:hAnsi="Times New Roman" w:cs="Times New Roman"/>
+          <w:sz w:val="24"/>
+          <w:szCs w:val="24"/>
+        </w:rPr>
+      </w:pPr>
+      <w:r>
+        <w:rPr>
+          <w:rFonts w:hint="default" w:ascii="Times New Roman" w:hAnsi="Times New Roman" w:cs="Times New Roman"/>
+          <w:sz w:val="24"/>
+          <w:szCs w:val="24"/>
+        </w:rPr>
+        <w:t xml:space="preserve">Example: vacuum cleaner agent </w:t>
       </w:r>
     </w:p>
     <w:p>
@@ -1159,143 +1032,27 @@
         <w:suppressLineNumbers w:val="0"/>
         <w:rPr>
           <w:rFonts w:hint="default" w:ascii="Times New Roman" w:hAnsi="Times New Roman" w:cs="Times New Roman"/>
-        </w:rPr>
-      </w:pPr>
-      <w:r>
-        <w:rPr>
-          <w:rFonts w:hint="default" w:ascii="Times New Roman" w:hAnsi="Times New Roman" w:cs="Times New Roman"/>
-        </w:rPr>
-        <w:t>Utility-Based Agent</w:t>
-      </w:r>
-    </w:p>
-    <w:p>
-      <w:pPr>
-        <w:keepNext w:val="0"/>
-        <w:keepLines w:val="0"/>
-        <w:widowControl/>
-        <w:numPr>
-          <w:ilvl w:val="0"/>
-          <w:numId w:val="8"/>
-        </w:numPr>
-        <w:suppressLineNumbers w:val="0"/>
-        <w:spacing w:before="0" w:beforeAutospacing="1" w:after="0" w:afterAutospacing="1"/>
-        <w:ind w:left="720" w:hanging="360"/>
-        <w:rPr>
-          <w:rFonts w:hint="default" w:ascii="Times New Roman" w:hAnsi="Times New Roman" w:cs="Times New Roman"/>
-        </w:rPr>
-      </w:pPr>
-      <w:r>
-        <w:rPr>
-          <w:rFonts w:hint="default" w:ascii="Times New Roman" w:hAnsi="Times New Roman" w:cs="Times New Roman"/>
-        </w:rPr>
-        <w:t xml:space="preserve">Chooses the best option among several possibilities </w:t>
-      </w:r>
-    </w:p>
-    <w:p>
-      <w:pPr>
-        <w:keepNext w:val="0"/>
-        <w:keepLines w:val="0"/>
-        <w:widowControl/>
-        <w:numPr>
-          <w:ilvl w:val="0"/>
-          <w:numId w:val="8"/>
-        </w:numPr>
-        <w:suppressLineNumbers w:val="0"/>
-        <w:spacing w:before="0" w:beforeAutospacing="1" w:after="0" w:afterAutospacing="1"/>
-        <w:ind w:left="720" w:hanging="360"/>
-        <w:rPr>
-          <w:rFonts w:hint="default" w:ascii="Times New Roman" w:hAnsi="Times New Roman" w:cs="Times New Roman"/>
-        </w:rPr>
-      </w:pPr>
-      <w:r>
-        <w:rPr>
-          <w:rFonts w:hint="default" w:ascii="Times New Roman" w:hAnsi="Times New Roman" w:cs="Times New Roman"/>
-        </w:rPr>
-        <w:t xml:space="preserve">Uses utility functions to evaluate outcomes </w:t>
-      </w:r>
-    </w:p>
-    <w:p>
-      <w:pPr>
-        <w:pStyle w:val="2"/>
-        <w:keepNext w:val="0"/>
-        <w:keepLines w:val="0"/>
-        <w:widowControl/>
-        <w:suppressLineNumbers w:val="0"/>
-        <w:rPr>
-          <w:rFonts w:hint="default" w:ascii="Times New Roman" w:hAnsi="Times New Roman" w:cs="Times New Roman"/>
-        </w:rPr>
-      </w:pPr>
-      <w:r>
-        <w:rPr>
-          <w:rFonts w:hint="default" w:ascii="Times New Roman" w:hAnsi="Times New Roman" w:cs="Times New Roman"/>
-        </w:rPr>
-        <w:t>Learning Agent</w:t>
-      </w:r>
-    </w:p>
-    <w:p>
-      <w:pPr>
-        <w:keepNext w:val="0"/>
-        <w:keepLines w:val="0"/>
-        <w:widowControl/>
-        <w:numPr>
-          <w:ilvl w:val="0"/>
-          <w:numId w:val="9"/>
-        </w:numPr>
-        <w:suppressLineNumbers w:val="0"/>
-        <w:spacing w:before="0" w:beforeAutospacing="1" w:after="0" w:afterAutospacing="1"/>
-        <w:ind w:left="720" w:hanging="360"/>
-        <w:rPr>
-          <w:rFonts w:hint="default" w:ascii="Times New Roman" w:hAnsi="Times New Roman" w:cs="Times New Roman"/>
-        </w:rPr>
-      </w:pPr>
-      <w:r>
-        <w:rPr>
-          <w:rFonts w:hint="default" w:ascii="Times New Roman" w:hAnsi="Times New Roman" w:cs="Times New Roman"/>
-        </w:rPr>
-        <w:t xml:space="preserve">Learns from experience instead of relying only on fixed instructions </w:t>
-      </w:r>
-    </w:p>
-    <w:p>
-      <w:pPr>
-        <w:keepNext w:val="0"/>
-        <w:keepLines w:val="0"/>
-        <w:widowControl/>
-        <w:numPr>
-          <w:ilvl w:val="0"/>
-          <w:numId w:val="9"/>
-        </w:numPr>
-        <w:suppressLineNumbers w:val="0"/>
-        <w:spacing w:before="0" w:beforeAutospacing="1" w:after="0" w:afterAutospacing="1"/>
-        <w:ind w:left="720" w:hanging="360"/>
-        <w:rPr>
-          <w:rFonts w:hint="default" w:ascii="Times New Roman" w:hAnsi="Times New Roman" w:cs="Times New Roman"/>
-        </w:rPr>
-      </w:pPr>
-      <w:r>
-        <w:rPr>
-          <w:rFonts w:hint="default" w:ascii="Times New Roman" w:hAnsi="Times New Roman" w:cs="Times New Roman"/>
-        </w:rPr>
-        <w:t xml:space="preserve">More adaptable to unknown environments </w:t>
-      </w:r>
-    </w:p>
-    <w:p>
-      <w:pPr>
-        <w:keepNext w:val="0"/>
-        <w:keepLines w:val="0"/>
-        <w:widowControl/>
-        <w:numPr>
-          <w:numId w:val="0"/>
-        </w:numPr>
-        <w:suppressLineNumbers w:val="0"/>
-        <w:spacing w:before="0" w:beforeAutospacing="1" w:after="0" w:afterAutospacing="1"/>
-        <w:ind w:leftChars="0"/>
-        <w:rPr>
-          <w:rFonts w:hint="default" w:ascii="Times New Roman" w:hAnsi="Times New Roman" w:eastAsia="SimSun" w:cs="Times New Roman"/>
+          <w:sz w:val="24"/>
+          <w:szCs w:val="24"/>
+        </w:rPr>
+      </w:pPr>
+      <w:r>
+        <w:rPr>
+          <w:rFonts w:hint="default" w:ascii="Times New Roman" w:hAnsi="Times New Roman" w:cs="Times New Roman"/>
           <w:sz w:val="24"/>
           <w:szCs w:val="24"/>
           <w:lang w:val="en-US"/>
         </w:rPr>
-      </w:pPr>
+        <w:t xml:space="preserve">- </w:t>
+      </w:r>
+      <w:r>
+        <w:rPr>
+          <w:rFonts w:hint="default" w:ascii="Times New Roman" w:hAnsi="Times New Roman" w:cs="Times New Roman"/>
+          <w:sz w:val="24"/>
+          <w:szCs w:val="24"/>
+        </w:rPr>
+        <w:t>Model-Based Reflex Agent</w:t>
+      </w:r>
       <w:bookmarkStart w:id="0" w:name="_GoBack"/>
       <w:bookmarkEnd w:id="0"/>
     </w:p>
@@ -1305,6 +1062,329 @@
         <w:keepLines w:val="0"/>
         <w:widowControl/>
         <w:numPr>
+          <w:ilvl w:val="0"/>
+          <w:numId w:val="6"/>
+        </w:numPr>
+        <w:suppressLineNumbers w:val="0"/>
+        <w:spacing w:before="0" w:beforeAutospacing="1" w:after="0" w:afterAutospacing="1"/>
+        <w:ind w:left="720" w:hanging="360"/>
+        <w:rPr>
+          <w:rFonts w:hint="default" w:ascii="Times New Roman" w:hAnsi="Times New Roman" w:cs="Times New Roman"/>
+          <w:sz w:val="24"/>
+          <w:szCs w:val="24"/>
+        </w:rPr>
+      </w:pPr>
+      <w:r>
+        <w:rPr>
+          <w:rFonts w:hint="default" w:ascii="Times New Roman" w:hAnsi="Times New Roman" w:cs="Times New Roman"/>
+          <w:sz w:val="24"/>
+          <w:szCs w:val="24"/>
+        </w:rPr>
+        <w:t xml:space="preserve">Maintains internal state </w:t>
+      </w:r>
+    </w:p>
+    <w:p>
+      <w:pPr>
+        <w:keepNext w:val="0"/>
+        <w:keepLines w:val="0"/>
+        <w:widowControl/>
+        <w:numPr>
+          <w:ilvl w:val="0"/>
+          <w:numId w:val="6"/>
+        </w:numPr>
+        <w:suppressLineNumbers w:val="0"/>
+        <w:spacing w:before="0" w:beforeAutospacing="1" w:after="0" w:afterAutospacing="1"/>
+        <w:ind w:left="720" w:hanging="360"/>
+        <w:rPr>
+          <w:rFonts w:hint="default" w:ascii="Times New Roman" w:hAnsi="Times New Roman" w:cs="Times New Roman"/>
+          <w:sz w:val="24"/>
+          <w:szCs w:val="24"/>
+        </w:rPr>
+      </w:pPr>
+      <w:r>
+        <w:rPr>
+          <w:rFonts w:hint="default" w:ascii="Times New Roman" w:hAnsi="Times New Roman" w:cs="Times New Roman"/>
+          <w:b/>
+          <w:bCs/>
+          <w:sz w:val="24"/>
+          <w:szCs w:val="24"/>
+        </w:rPr>
+        <w:t>Uses knowledge</w:t>
+      </w:r>
+      <w:r>
+        <w:rPr>
+          <w:rFonts w:hint="default" w:ascii="Times New Roman" w:hAnsi="Times New Roman" w:cs="Times New Roman"/>
+          <w:sz w:val="24"/>
+          <w:szCs w:val="24"/>
+        </w:rPr>
+        <w:t xml:space="preserve"> about how the world changes </w:t>
+      </w:r>
+    </w:p>
+    <w:p>
+      <w:pPr>
+        <w:pStyle w:val="2"/>
+        <w:keepNext w:val="0"/>
+        <w:keepLines w:val="0"/>
+        <w:widowControl/>
+        <w:suppressLineNumbers w:val="0"/>
+        <w:rPr>
+          <w:rFonts w:hint="default" w:ascii="Times New Roman" w:hAnsi="Times New Roman" w:cs="Times New Roman"/>
+          <w:sz w:val="24"/>
+          <w:szCs w:val="24"/>
+        </w:rPr>
+      </w:pPr>
+      <w:r>
+        <w:rPr>
+          <w:rFonts w:hint="default" w:ascii="Times New Roman" w:hAnsi="Times New Roman" w:cs="Times New Roman"/>
+          <w:sz w:val="24"/>
+          <w:szCs w:val="24"/>
+        </w:rPr>
+        <w:t>Goal-Based Agent</w:t>
+      </w:r>
+    </w:p>
+    <w:p>
+      <w:pPr>
+        <w:keepNext w:val="0"/>
+        <w:keepLines w:val="0"/>
+        <w:widowControl/>
+        <w:numPr>
+          <w:ilvl w:val="0"/>
+          <w:numId w:val="7"/>
+        </w:numPr>
+        <w:suppressLineNumbers w:val="0"/>
+        <w:spacing w:before="0" w:beforeAutospacing="1" w:after="0" w:afterAutospacing="1"/>
+        <w:ind w:left="720" w:hanging="360"/>
+        <w:rPr>
+          <w:rFonts w:hint="default" w:ascii="Times New Roman" w:hAnsi="Times New Roman" w:cs="Times New Roman"/>
+          <w:sz w:val="24"/>
+          <w:szCs w:val="24"/>
+        </w:rPr>
+      </w:pPr>
+      <w:r>
+        <w:rPr>
+          <w:rFonts w:hint="default" w:ascii="Times New Roman" w:hAnsi="Times New Roman" w:cs="Times New Roman"/>
+          <w:sz w:val="24"/>
+          <w:szCs w:val="24"/>
+        </w:rPr>
+        <w:t xml:space="preserve">Makes decisions based on goals </w:t>
+      </w:r>
+    </w:p>
+    <w:p>
+      <w:pPr>
+        <w:keepNext w:val="0"/>
+        <w:keepLines w:val="0"/>
+        <w:widowControl/>
+        <w:numPr>
+          <w:ilvl w:val="0"/>
+          <w:numId w:val="7"/>
+        </w:numPr>
+        <w:suppressLineNumbers w:val="0"/>
+        <w:spacing w:before="0" w:beforeAutospacing="1" w:after="0" w:afterAutospacing="1"/>
+        <w:ind w:left="720" w:hanging="360"/>
+        <w:rPr>
+          <w:rFonts w:hint="default" w:ascii="Times New Roman" w:hAnsi="Times New Roman" w:cs="Times New Roman"/>
+          <w:sz w:val="24"/>
+          <w:szCs w:val="24"/>
+        </w:rPr>
+      </w:pPr>
+      <w:r>
+        <w:rPr>
+          <w:rFonts w:hint="default" w:ascii="Times New Roman" w:hAnsi="Times New Roman" w:cs="Times New Roman"/>
+          <w:b/>
+          <w:bCs/>
+          <w:sz w:val="24"/>
+          <w:szCs w:val="24"/>
+        </w:rPr>
+        <w:t>Considers future outcomes and planning</w:t>
+      </w:r>
+      <w:r>
+        <w:rPr>
+          <w:rFonts w:hint="default" w:ascii="Times New Roman" w:hAnsi="Times New Roman" w:cs="Times New Roman"/>
+          <w:sz w:val="24"/>
+          <w:szCs w:val="24"/>
+        </w:rPr>
+        <w:t xml:space="preserve"> </w:t>
+      </w:r>
+    </w:p>
+    <w:p>
+      <w:pPr>
+        <w:pStyle w:val="2"/>
+        <w:keepNext w:val="0"/>
+        <w:keepLines w:val="0"/>
+        <w:widowControl/>
+        <w:suppressLineNumbers w:val="0"/>
+        <w:rPr>
+          <w:rFonts w:hint="default" w:ascii="Times New Roman" w:hAnsi="Times New Roman" w:cs="Times New Roman"/>
+          <w:sz w:val="24"/>
+          <w:szCs w:val="24"/>
+        </w:rPr>
+      </w:pPr>
+      <w:r>
+        <w:rPr>
+          <w:rFonts w:hint="default" w:ascii="Times New Roman" w:hAnsi="Times New Roman" w:cs="Times New Roman"/>
+          <w:sz w:val="24"/>
+          <w:szCs w:val="24"/>
+        </w:rPr>
+        <w:t>Utility-Based Agent</w:t>
+      </w:r>
+    </w:p>
+    <w:p>
+      <w:pPr>
+        <w:keepNext w:val="0"/>
+        <w:keepLines w:val="0"/>
+        <w:widowControl/>
+        <w:numPr>
+          <w:ilvl w:val="0"/>
+          <w:numId w:val="8"/>
+        </w:numPr>
+        <w:suppressLineNumbers w:val="0"/>
+        <w:spacing w:before="0" w:beforeAutospacing="1" w:after="0" w:afterAutospacing="1"/>
+        <w:ind w:left="720" w:hanging="360"/>
+        <w:rPr>
+          <w:rFonts w:hint="default" w:ascii="Times New Roman" w:hAnsi="Times New Roman" w:cs="Times New Roman"/>
+          <w:sz w:val="24"/>
+          <w:szCs w:val="24"/>
+        </w:rPr>
+      </w:pPr>
+      <w:r>
+        <w:rPr>
+          <w:rFonts w:hint="default" w:ascii="Times New Roman" w:hAnsi="Times New Roman" w:cs="Times New Roman"/>
+          <w:sz w:val="24"/>
+          <w:szCs w:val="24"/>
+        </w:rPr>
+        <w:t xml:space="preserve">Chooses the best option among several possibilities </w:t>
+      </w:r>
+    </w:p>
+    <w:p>
+      <w:pPr>
+        <w:keepNext w:val="0"/>
+        <w:keepLines w:val="0"/>
+        <w:widowControl/>
+        <w:numPr>
+          <w:ilvl w:val="0"/>
+          <w:numId w:val="8"/>
+        </w:numPr>
+        <w:suppressLineNumbers w:val="0"/>
+        <w:spacing w:before="0" w:beforeAutospacing="1" w:after="0" w:afterAutospacing="1"/>
+        <w:ind w:left="720" w:hanging="360"/>
+        <w:rPr>
+          <w:rFonts w:hint="default" w:ascii="Times New Roman" w:hAnsi="Times New Roman" w:cs="Times New Roman"/>
+          <w:sz w:val="24"/>
+          <w:szCs w:val="24"/>
+        </w:rPr>
+      </w:pPr>
+      <w:r>
+        <w:rPr>
+          <w:rFonts w:hint="default" w:ascii="Times New Roman" w:hAnsi="Times New Roman" w:cs="Times New Roman"/>
+          <w:sz w:val="24"/>
+          <w:szCs w:val="24"/>
+        </w:rPr>
+        <w:t xml:space="preserve">Uses utility functions to evaluate outcomes </w:t>
+      </w:r>
+    </w:p>
+    <w:p>
+      <w:pPr>
+        <w:pStyle w:val="2"/>
+        <w:keepNext w:val="0"/>
+        <w:keepLines w:val="0"/>
+        <w:widowControl/>
+        <w:suppressLineNumbers w:val="0"/>
+        <w:rPr>
+          <w:rFonts w:hint="default" w:ascii="Times New Roman" w:hAnsi="Times New Roman" w:cs="Times New Roman"/>
+          <w:sz w:val="24"/>
+          <w:szCs w:val="24"/>
+        </w:rPr>
+      </w:pPr>
+      <w:r>
+        <w:rPr>
+          <w:rFonts w:hint="default" w:ascii="Times New Roman" w:hAnsi="Times New Roman" w:cs="Times New Roman"/>
+          <w:sz w:val="24"/>
+          <w:szCs w:val="24"/>
+        </w:rPr>
+        <w:t>Learning Agent</w:t>
+      </w:r>
+    </w:p>
+    <w:p>
+      <w:pPr>
+        <w:keepNext w:val="0"/>
+        <w:keepLines w:val="0"/>
+        <w:widowControl/>
+        <w:numPr>
+          <w:ilvl w:val="0"/>
+          <w:numId w:val="9"/>
+        </w:numPr>
+        <w:suppressLineNumbers w:val="0"/>
+        <w:spacing w:before="0" w:beforeAutospacing="1" w:after="0" w:afterAutospacing="1"/>
+        <w:ind w:left="720" w:hanging="360"/>
+        <w:rPr>
+          <w:rFonts w:hint="default" w:ascii="Times New Roman" w:hAnsi="Times New Roman" w:cs="Times New Roman"/>
+          <w:sz w:val="24"/>
+          <w:szCs w:val="24"/>
+        </w:rPr>
+      </w:pPr>
+      <w:r>
+        <w:rPr>
+          <w:rFonts w:hint="default" w:ascii="Times New Roman" w:hAnsi="Times New Roman" w:cs="Times New Roman"/>
+          <w:sz w:val="24"/>
+          <w:szCs w:val="24"/>
+        </w:rPr>
+        <w:t xml:space="preserve">Learns from experience instead of relying only on fixed instructions </w:t>
+      </w:r>
+    </w:p>
+    <w:p>
+      <w:pPr>
+        <w:keepNext w:val="0"/>
+        <w:keepLines w:val="0"/>
+        <w:widowControl/>
+        <w:numPr>
+          <w:ilvl w:val="0"/>
+          <w:numId w:val="9"/>
+        </w:numPr>
+        <w:suppressLineNumbers w:val="0"/>
+        <w:spacing w:before="0" w:beforeAutospacing="1" w:after="0" w:afterAutospacing="1"/>
+        <w:ind w:left="720" w:hanging="360"/>
+        <w:rPr>
+          <w:rFonts w:hint="default" w:ascii="Times New Roman" w:hAnsi="Times New Roman" w:cs="Times New Roman"/>
+          <w:sz w:val="24"/>
+          <w:szCs w:val="24"/>
+        </w:rPr>
+      </w:pPr>
+      <w:r>
+        <w:rPr>
+          <w:rFonts w:hint="default" w:ascii="Times New Roman" w:hAnsi="Times New Roman" w:cs="Times New Roman"/>
+          <w:sz w:val="24"/>
+          <w:szCs w:val="24"/>
+        </w:rPr>
+        <w:t xml:space="preserve">More adaptable to unknown environments </w:t>
+      </w:r>
+    </w:p>
+    <w:p>
+      <w:pPr>
+        <w:keepNext w:val="0"/>
+        <w:keepLines w:val="0"/>
+        <w:widowControl/>
+        <w:numPr>
+          <w:ilvl w:val="0"/>
+          <w:numId w:val="0"/>
+        </w:numPr>
+        <w:suppressLineNumbers w:val="0"/>
+        <w:spacing w:before="0" w:beforeAutospacing="1" w:after="0" w:afterAutospacing="1"/>
+        <w:ind w:leftChars="0"/>
+        <w:rPr>
+          <w:rFonts w:hint="default" w:ascii="Times New Roman" w:hAnsi="Times New Roman" w:eastAsia="SimSun" w:cs="Times New Roman"/>
+          <w:sz w:val="24"/>
+          <w:szCs w:val="24"/>
+          <w:lang w:val="en-US"/>
+        </w:rPr>
+      </w:pPr>
+    </w:p>
+    <w:p>
+      <w:pPr>
+        <w:keepNext w:val="0"/>
+        <w:keepLines w:val="0"/>
+        <w:widowControl/>
+        <w:numPr>
+          <w:ilvl w:val="0"/>
           <w:numId w:val="0"/>
         </w:numPr>
         <w:suppressLineNumbers w:val="0"/>

</xml_diff>